<commit_message>
Add references, new commands, and EliseAI resume; restructure for shareability
- Added references/ dir (template-strings, ats-reference, cover-letter, linkedin examples)
- Added linkedin-outreach and smaller-summary-writer commands
- Updated resume-optimizer skill and CLAUDE.md after restructure
- Replaced AirOps resume outputs with EliseAI outputs
- Removed SKILL.md (superseded by .claude/commands/)
- Updated .gitignore to exclude ats_config.json and unpacked_template_check/
- Updated resume_template.docx and unpacked_template/ to latest

Co-Authored-By: Claude Sonnet 4.6 <noreply@anthropic.com>
</commit_message>
<xml_diff>
--- a/resume_template.docx
+++ b/resume_template.docx
@@ -50,13 +50,13 @@
         </w:rPr>
         <w:t xml:space="preserve">(714) 350-8481 | aatum.desai@outlook.com | </w:t>
       </w:r>
-      <w:hyperlink r:id="rId12" w:history="1">
+      <w:hyperlink r:id="rId10" w:history="1">
         <w:r>
           <w:rPr>
             <w:rFonts w:ascii="Times New Roman" w:hAnsi="Times New Roman"/>
+            <w:color w:val="0563C1"/>
             <w:sz w:val="21"/>
             <w:szCs w:val="21"/>
-            <w:color w:val="0563C1"/>
             <w:u w:val="single"/>
           </w:rPr>
           <w:t>aatumdesai.com</w:t>
@@ -70,13 +70,13 @@
         </w:rPr>
         <w:t xml:space="preserve"> | </w:t>
       </w:r>
-      <w:hyperlink r:id="rId13" w:history="1">
+      <w:hyperlink r:id="rId11" w:history="1">
         <w:r>
           <w:rPr>
             <w:rFonts w:ascii="Times New Roman" w:hAnsi="Times New Roman"/>
+            <w:color w:val="0563C1"/>
             <w:sz w:val="21"/>
             <w:szCs w:val="21"/>
-            <w:color w:val="0563C1"/>
             <w:u w:val="single"/>
           </w:rPr>
           <w:t>linkedin.com/in/aatumdesai</w:t>
@@ -259,7 +259,6 @@
         <w:tabs>
           <w:tab w:val="right" w:pos="10800"/>
         </w:tabs>
-        <w:spacing w:before="80"/>
         <w:rPr>
           <w:rFonts w:ascii="Times New Roman" w:hAnsi="Times New Roman"/>
           <w:sz w:val="20"/>
@@ -270,7 +269,23 @@
           <w:rFonts w:ascii="Times New Roman" w:hAnsi="Times New Roman"/>
           <w:sz w:val="20"/>
         </w:rPr>
-        <w:t>Led tradeoff-based prioritization study (MaxDiff) across 65 AI use cases for product managers, informing AI roadmap focus and GTM positioning around highest-impact adoption drivers</w:t>
+        <w:t>Directed roadmap prioritization across 60 AI use cases using market research (</w:t>
+      </w:r>
+      <w:proofErr w:type="spellStart"/>
+      <w:r>
+        <w:rPr>
+          <w:rFonts w:ascii="Times New Roman" w:hAnsi="Times New Roman"/>
+          <w:sz w:val="20"/>
+        </w:rPr>
+        <w:t>MaxDiff</w:t>
+      </w:r>
+      <w:proofErr w:type="spellEnd"/>
+      <w:r>
+        <w:rPr>
+          <w:rFonts w:ascii="Times New Roman" w:hAnsi="Times New Roman"/>
+          <w:sz w:val="20"/>
+        </w:rPr>
+        <w:t xml:space="preserve"> survey) to identify customer preferences; guided allocation of engineering capacity and GTM investment toward highest-impact adoption drivers</w:t>
       </w:r>
     </w:p>
     <w:p>
@@ -292,7 +307,7 @@
           <w:rFonts w:ascii="Times New Roman" w:hAnsi="Times New Roman"/>
           <w:sz w:val="20"/>
         </w:rPr>
-        <w:t>Designed and drove a revenue capture strategy for customers exceeding contracted seat limits, converting product usage analytics into actionable expansion motions for Sales</w:t>
+        <w:t>Built customer segmentation model to prioritize expansion accounts for identified seat-overage opportunity, increasing efficiency of revenue capture and converting excess usage into incremental $1M contracted ARR</w:t>
       </w:r>
     </w:p>
     <w:p>
@@ -314,7 +329,7 @@
           <w:rFonts w:ascii="Times New Roman" w:hAnsi="Times New Roman"/>
           <w:sz w:val="20"/>
         </w:rPr>
-        <w:t>Identified account fragmentation between self-serve and enterprise customers and designed consolidation motion, improving account-level adoption within existing enterprise contracts</w:t>
+        <w:t>Redesigned churn risk framework by integrating AI-derived customer call transcript sentiment with product health metrics, improving accuracy of high-risk account ranking by 22%, enabling targeted retention strategies</w:t>
       </w:r>
     </w:p>
     <w:p>
@@ -336,7 +351,7 @@
           <w:rFonts w:ascii="Times New Roman" w:hAnsi="Times New Roman"/>
           <w:sz w:val="20"/>
         </w:rPr>
-        <w:t>Act as internal strategy consultant across Product, Marketing, Sales, and Finance, aligning stakeholders to execute high-priority initiatives and establish scalable operating frameworks</w:t>
+        <w:t>Established performance management framework for new product launch by defining success metrics and building cross-functional reporting infrastructure, aligning Product, Sales, and Marketing around revenue and adoption targets</w:t>
       </w:r>
     </w:p>
     <w:p>
@@ -753,6 +768,14 @@
           <w:sz w:val="20"/>
         </w:rPr>
         <w:t>Master of Business Administration, Marketing Analytics and Finance Specializations</w:t>
+      </w:r>
+      <w:r>
+        <w:rPr>
+          <w:rFonts w:ascii="Times New Roman" w:hAnsi="Times New Roman"/>
+          <w:b/>
+          <w:i/>
+          <w:sz w:val="20"/>
+        </w:rPr>
         <w:tab/>
       </w:r>
       <w:r>
@@ -915,6 +938,12 @@
           <w:sz w:val="20"/>
         </w:rPr>
         <w:t>: Advised client on acquisition of online car auction platform, developed GTM strategy rooted in customer research</w:t>
+      </w:r>
+      <w:r>
+        <w:rPr>
+          <w:rFonts w:ascii="Times New Roman" w:hAnsi="Times New Roman"/>
+          <w:sz w:val="20"/>
+        </w:rPr>
         <w:tab/>
       </w:r>
     </w:p>
@@ -1174,7 +1203,7 @@
         <v:path o:extrusionok="f" gradientshapeok="t" o:connecttype="rect"/>
         <o:lock v:ext="edit" aspectratio="t"/>
       </v:shapetype>
-      <v:shape id="_x0000_i1025" type="#_x0000_t75" style="width:9.6pt;height:9.6pt;visibility:visible;mso-wrap-style:square" o:bullet="t">
+      <v:shape id="_x0000_i1025" type="#_x0000_t75" style="width:9.8pt;height:9.8pt;visibility:visible;mso-wrap-style:square" o:bullet="t">
         <v:imagedata r:id="rId1" o:title=""/>
       </v:shape>
     </w:pict>
@@ -5899,6 +5928,24 @@
 </file>
 
 <file path=customXml/item1.xml><?xml version="1.0" encoding="utf-8"?>
+<?mso-contentType ?>
+<FormTemplates xmlns="http://schemas.microsoft.com/sharepoint/v3/contenttype/forms">
+  <Display>DocumentLibraryForm</Display>
+  <Edit>DocumentLibraryForm</Edit>
+  <New>DocumentLibraryForm</New>
+</FormTemplates>
+</file>
+
+<file path=customXml/item2.xml><?xml version="1.0" encoding="utf-8"?>
+<p:properties xmlns:p="http://schemas.microsoft.com/office/2006/metadata/properties" xmlns:xsi="http://www.w3.org/2001/XMLSchema-instance" xmlns:pc="http://schemas.microsoft.com/office/infopath/2007/PartnerControls">
+  <documentManagement>
+    <PublishingExpirationDate xmlns="http://schemas.microsoft.com/sharepoint/v3" xsi:nil="true"/>
+    <PublishingStartDate xmlns="http://schemas.microsoft.com/sharepoint/v3" xsi:nil="true"/>
+  </documentManagement>
+</p:properties>
+</file>
+
+<file path=customXml/item3.xml><?xml version="1.0" encoding="utf-8"?>
 <ct:contentTypeSchema xmlns:ct="http://schemas.microsoft.com/office/2006/metadata/contentType" xmlns:ma="http://schemas.microsoft.com/office/2006/metadata/properties/metaAttributes" ct:_="" ma:_="" ma:contentTypeName="Document" ma:contentTypeID="0x010100BF3BC59B4379BA40AFEFA6E184A79844" ma:contentTypeVersion="1" ma:contentTypeDescription="Create a new document." ma:contentTypeScope="" ma:versionID="53e66b2e17bfe22835c2095af8e91e3b">
   <xsd:schema xmlns:xsd="http://www.w3.org/2001/XMLSchema" xmlns:xs="http://www.w3.org/2001/XMLSchema" xmlns:p="http://schemas.microsoft.com/office/2006/metadata/properties" xmlns:ns1="http://schemas.microsoft.com/sharepoint/v3" targetNamespace="http://schemas.microsoft.com/office/2006/metadata/properties" ma:root="true" ma:fieldsID="3957af3f9c07d0358322a57020564ff9" ns1:_="">
     <xsd:import namespace="http://schemas.microsoft.com/sharepoint/v3"/>
@@ -6030,25 +6077,25 @@
 </ct:contentTypeSchema>
 </file>
 
-<file path=customXml/item2.xml><?xml version="1.0" encoding="utf-8"?>
-<p:properties xmlns:p="http://schemas.microsoft.com/office/2006/metadata/properties" xmlns:xsi="http://www.w3.org/2001/XMLSchema-instance" xmlns:pc="http://schemas.microsoft.com/office/infopath/2007/PartnerControls">
-  <documentManagement>
-    <PublishingExpirationDate xmlns="http://schemas.microsoft.com/sharepoint/v3" xsi:nil="true"/>
-    <PublishingStartDate xmlns="http://schemas.microsoft.com/sharepoint/v3" xsi:nil="true"/>
-  </documentManagement>
-</p:properties>
+<file path=customXml/itemProps1.xml><?xml version="1.0" encoding="utf-8"?>
+<ds:datastoreItem xmlns:ds="http://schemas.openxmlformats.org/officeDocument/2006/customXml" ds:itemID="{C8790BCB-A6B2-421C-8B84-EB541E365BD8}">
+  <ds:schemaRefs>
+    <ds:schemaRef ds:uri="http://schemas.microsoft.com/sharepoint/v3/contenttype/forms"/>
+  </ds:schemaRefs>
+</ds:datastoreItem>
 </file>
 
-<file path=customXml/item3.xml><?xml version="1.0" encoding="utf-8"?>
-<?mso-contentType ?>
-<FormTemplates xmlns="http://schemas.microsoft.com/sharepoint/v3/contenttype/forms">
-  <Display>DocumentLibraryForm</Display>
-  <Edit>DocumentLibraryForm</Edit>
-  <New>DocumentLibraryForm</New>
-</FormTemplates>
+<file path=customXml/itemProps2.xml><?xml version="1.0" encoding="utf-8"?>
+<ds:datastoreItem xmlns:ds="http://schemas.openxmlformats.org/officeDocument/2006/customXml" ds:itemID="{3F40B608-C290-4619-A936-6E98438ECB5E}">
+  <ds:schemaRefs>
+    <ds:schemaRef ds:uri="http://schemas.microsoft.com/office/2006/metadata/properties"/>
+    <ds:schemaRef ds:uri="http://schemas.microsoft.com/office/infopath/2007/PartnerControls"/>
+    <ds:schemaRef ds:uri="http://schemas.microsoft.com/sharepoint/v3"/>
+  </ds:schemaRefs>
+</ds:datastoreItem>
 </file>
 
-<file path=customXml/itemProps1.xml><?xml version="1.0" encoding="utf-8"?>
+<file path=customXml/itemProps3.xml><?xml version="1.0" encoding="utf-8"?>
 <ds:datastoreItem xmlns:ds="http://schemas.openxmlformats.org/officeDocument/2006/customXml" ds:itemID="{106ADE10-3A19-43D6-B782-34B913A1E4CB}">
   <ds:schemaRefs>
     <ds:schemaRef ds:uri="http://schemas.microsoft.com/office/2006/metadata/contentType"/>
@@ -6064,22 +6111,4 @@
     <ds:schemaRef ds:uri="http://schemas.microsoft.com/internal/obd"/>
   </ds:schemaRefs>
 </ds:datastoreItem>
-</file>
-
-<file path=customXml/itemProps2.xml><?xml version="1.0" encoding="utf-8"?>
-<ds:datastoreItem xmlns:ds="http://schemas.openxmlformats.org/officeDocument/2006/customXml" ds:itemID="{3F40B608-C290-4619-A936-6E98438ECB5E}">
-  <ds:schemaRefs>
-    <ds:schemaRef ds:uri="http://schemas.microsoft.com/office/2006/metadata/properties"/>
-    <ds:schemaRef ds:uri="http://schemas.microsoft.com/office/infopath/2007/PartnerControls"/>
-    <ds:schemaRef ds:uri="http://schemas.microsoft.com/sharepoint/v3"/>
-  </ds:schemaRefs>
-</ds:datastoreItem>
-</file>
-
-<file path=customXml/itemProps3.xml><?xml version="1.0" encoding="utf-8"?>
-<ds:datastoreItem xmlns:ds="http://schemas.openxmlformats.org/officeDocument/2006/customXml" ds:itemID="{C8790BCB-A6B2-421C-8B84-EB541E365BD8}">
-  <ds:schemaRefs>
-    <ds:schemaRef ds:uri="http://schemas.microsoft.com/sharepoint/v3/contenttype/forms"/>
-  </ds:schemaRefs>
-</ds:datastoreItem>
 </file>
</xml_diff>